<commit_message>
Make full clickable GitHub address prominent on manual cover
</commit_message>
<xml_diff>
--- a/docs/user-guide.docx
+++ b/docs/user-guide.docx
@@ -76,9 +76,28 @@
     </w:p>
     <w:p>
       <w:pPr>
-        <w:spacing w:before="40" w:after="440"/>
-        <w:ind w:firstLine="0" w:left="3200" w:right="3200"/>
-      </w:pPr>
+        <w:spacing w:before="320" w:after="240" w:line="288" w:lineRule="auto"/>
+        <w:ind w:left="0" w:right="0" w:firstLine="0"/>
+        <w:jc w:val="center"/>
+      </w:pPr>
+      <w:r>
+        <w:rPr>
+          <w:b/>
+        </w:rPr>
+        <w:t>GitHub 项目网址  点击下方完整地址打开</w:t>
+        <w:br/>
+      </w:r>
+      <w:hyperlink r:id="rId24">
+        <w:r>
+          <w:rPr>
+            <w:color w:val="0563C1"/>
+            <w:u w:val="single"/>
+            <w:sz w:val="22"/>
+            <w:rFonts w:ascii="Arial" w:hAnsi="Arial" w:eastAsia="Heiti SC"/>
+          </w:rPr>
+          <w:t>https://github.com/nhy0512-design/CampusRFID-Pickup-System</w:t>
+        </w:r>
+      </w:hyperlink>
     </w:p>
     <w:p>
       <w:pPr>
@@ -6009,9 +6028,17 @@
       </w:hyperlink>
     </w:p>
     <w:p>
-      <w:r>
-        <w:t>https://github.com/nhy0512-design/CampusRFID-Pickup-System</w:t>
-      </w:r>
+      <w:hyperlink r:id="rId24">
+        <w:r>
+          <w:rPr>
+            <w:color w:val="0563C1"/>
+            <w:u w:val="single"/>
+            <w:sz w:val="22"/>
+            <w:rFonts w:ascii="Arial" w:hAnsi="Arial" w:eastAsia="Heiti SC"/>
+          </w:rPr>
+          <w:t>https://github.com/nhy0512-design/CampusRFID-Pickup-System</w:t>
+        </w:r>
+      </w:hyperlink>
     </w:p>
     <w:p>
       <w:hyperlink r:id="rId25">

</xml_diff>